<commit_message>
Refactoring-1: Das Datenmodel wurde geändert, sodass reine Samllungen von Daten in der DB erzeugt werden. In diesem zusammenhang wurde implementiert das die folgenden Daten im Code erzeugt und in die DB geladen werden "Disziplin, Alterklasse, Verbnad".
</commit_message>
<xml_diff>
--- a/todos.docx
+++ b/todos.docx
@@ -41,6 +41,134 @@
           <w:bCs/>
         </w:rPr>
       </w:pPr>
+      <w:proofErr w:type="spellStart"/>
+      <w:r>
+        <w:rPr>
+          <w:b/>
+          <w:bCs/>
+        </w:rPr>
+        <w:t>Alterklassen</w:t>
+      </w:r>
+      <w:proofErr w:type="spellEnd"/>
+      <w:r>
+        <w:rPr>
+          <w:b/>
+          <w:bCs/>
+        </w:rPr>
+        <w:t xml:space="preserve"> </w:t>
+      </w:r>
+      <w:proofErr w:type="spellStart"/>
+      <w:r>
+        <w:rPr>
+          <w:b/>
+          <w:bCs/>
+        </w:rPr>
+        <w:t>lsiute</w:t>
+      </w:r>
+      <w:proofErr w:type="spellEnd"/>
+      <w:r>
+        <w:rPr>
+          <w:b/>
+          <w:bCs/>
+        </w:rPr>
+        <w:t xml:space="preserve"> anfertigen in </w:t>
+      </w:r>
+      <w:proofErr w:type="spellStart"/>
+      <w:r>
+        <w:rPr>
+          <w:b/>
+          <w:bCs/>
+        </w:rPr>
+        <w:t>excel</w:t>
+      </w:r>
+      <w:proofErr w:type="spellEnd"/>
+    </w:p>
+    <w:p>
+      <w:pPr>
+        <w:rPr>
+          <w:b/>
+          <w:bCs/>
+        </w:rPr>
+      </w:pPr>
+      <w:r>
+        <w:rPr>
+          <w:b/>
+          <w:bCs/>
+        </w:rPr>
+        <w:t xml:space="preserve">Dann </w:t>
+      </w:r>
+      <w:proofErr w:type="spellStart"/>
+      <w:r>
+        <w:rPr>
+          <w:b/>
+          <w:bCs/>
+        </w:rPr>
+        <w:t>datenstrukru</w:t>
+      </w:r>
+      <w:proofErr w:type="spellEnd"/>
+      <w:r>
+        <w:rPr>
+          <w:b/>
+          <w:bCs/>
+        </w:rPr>
+        <w:t xml:space="preserve"> und </w:t>
+      </w:r>
+      <w:proofErr w:type="spellStart"/>
+      <w:r>
+        <w:rPr>
+          <w:b/>
+          <w:bCs/>
+        </w:rPr>
+        <w:t>klassen</w:t>
+      </w:r>
+      <w:proofErr w:type="spellEnd"/>
+      <w:r>
+        <w:rPr>
+          <w:b/>
+          <w:bCs/>
+        </w:rPr>
+        <w:t xml:space="preserve"> </w:t>
+      </w:r>
+      <w:proofErr w:type="spellStart"/>
+      <w:r>
+        <w:rPr>
+          <w:b/>
+          <w:bCs/>
+        </w:rPr>
+        <w:t>springboot</w:t>
+      </w:r>
+      <w:proofErr w:type="spellEnd"/>
+      <w:r>
+        <w:rPr>
+          <w:b/>
+          <w:bCs/>
+        </w:rPr>
+        <w:t xml:space="preserve"> erstellen und DB damit füllen</w:t>
+      </w:r>
+    </w:p>
+    <w:p>
+      <w:pPr>
+        <w:rPr>
+          <w:b/>
+          <w:bCs/>
+        </w:rPr>
+      </w:pPr>
+    </w:p>
+    <w:p>
+      <w:pPr>
+        <w:rPr>
+          <w:b/>
+          <w:bCs/>
+        </w:rPr>
+      </w:pPr>
+    </w:p>
+    <w:p>
+      <w:pPr>
+        <w:rPr>
+          <w:b/>
+          <w:bCs/>
+        </w:rPr>
+      </w:pPr>
       <w:r>
         <w:rPr>
           <w:b/>
@@ -364,8 +492,9 @@
     </w:p>
     <w:p>
       <w:r>
+        <w:lastRenderedPageBreak/>
         <w:pict w14:anchorId="374DE88E">
-          <v:rect id="_x0000_i1031" style="width:0;height:1.5pt" o:hralign="center" o:hrstd="t" o:hr="t" fillcolor="#a0a0a0" stroked="f"/>
+          <v:rect id="_x0000_i1025" style="width:0;height:1.5pt" o:hralign="center" o:hrstd="t" o:hr="t" fillcolor="#a0a0a0" stroked="f"/>
         </w:pict>
       </w:r>
     </w:p>

</xml_diff>